<commit_message>
Added badges and rewards
</commit_message>
<xml_diff>
--- a/documents/reward-system.docx
+++ b/documents/reward-system.docx
@@ -406,20 +406,9 @@
       </w:r>
     </w:p>
     <w:p>
-      <w:pPr>
-        <w:numPr>
-          <w:ilvl w:val="0"/>
-          <w:numId w:val="5"/>
-        </w:numPr>
-      </w:pPr>
-      <w:r>
-        <w:t>Legend</w:t>
-      </w:r>
-    </w:p>
-    <w:p>
       <w:r>
         <w:pict w14:anchorId="725ED14D">
-          <v:rect id="_x0000_i1111" style="width:0;height:1.5pt" o:hralign="center" o:hrstd="t" o:hr="t" fillcolor="#a0a0a0" stroked="f"/>
+          <v:rect id="_x0000_i1144" style="width:0;height:1.5pt" o:hralign="center" o:hrstd="t" o:hr="t" fillcolor="#a0a0a0" stroked="f"/>
         </w:pict>
       </w:r>
     </w:p>
@@ -430,7 +419,6 @@
           <w:bCs/>
         </w:rPr>
       </w:pPr>
-      <w:proofErr w:type="spellStart"/>
       <w:r>
         <w:rPr>
           <w:b/>
@@ -438,7 +426,6 @@
         </w:rPr>
         <w:t>Unlockables</w:t>
       </w:r>
-      <w:proofErr w:type="spellEnd"/>
     </w:p>
     <w:p>
       <w:r>
@@ -595,22 +582,6 @@
     </w:p>
     <w:p>
       <w:r>
-        <w:t xml:space="preserve">Apps like </w:t>
-      </w:r>
-      <w:r>
-        <w:rPr>
-          <w:b/>
-          <w:bCs/>
-        </w:rPr>
-        <w:t>Duolingo</w:t>
-      </w:r>
-      <w:r>
-        <w:t xml:space="preserve"> use streaks very successfully.</w:t>
-      </w:r>
-    </w:p>
-    <w:p>
-      <w:r>
-        <w:lastRenderedPageBreak/>
         <w:pict w14:anchorId="514A6156">
           <v:rect id="_x0000_i1113" style="width:0;height:1.5pt" o:hralign="center" o:hrstd="t" o:hr="t" fillcolor="#a0a0a0" stroked="f"/>
         </w:pict>
@@ -633,6 +604,7 @@
     </w:p>
     <w:p>
       <w:r>
+        <w:lastRenderedPageBreak/>
         <w:t>Competition motivates older kids.</w:t>
       </w:r>
     </w:p>
@@ -678,21 +650,12 @@
           <w:numId w:val="9"/>
         </w:numPr>
       </w:pPr>
-      <w:proofErr w:type="gramStart"/>
       <w:r>
         <w:rPr>
           <w:b/>
           <w:bCs/>
         </w:rPr>
-        <w:t>friends</w:t>
-      </w:r>
-      <w:proofErr w:type="gramEnd"/>
-      <w:r>
-        <w:rPr>
-          <w:b/>
-          <w:bCs/>
-        </w:rPr>
-        <w:t xml:space="preserve"> leaderboard</w:t>
+        <w:t>friends leaderboard</w:t>
       </w:r>
     </w:p>
     <w:p>
@@ -878,7 +841,6 @@
         </w:numPr>
       </w:pPr>
       <w:r>
-        <w:lastRenderedPageBreak/>
         <w:t>special quizzes</w:t>
       </w:r>
     </w:p>
@@ -899,6 +861,7 @@
           <w:b/>
           <w:bCs/>
         </w:rPr>
+        <w:lastRenderedPageBreak/>
         <w:t>History Month</w:t>
       </w:r>
     </w:p>
@@ -1149,7 +1112,6 @@
     </w:p>
     <w:p>
       <w:r>
-        <w:lastRenderedPageBreak/>
         <w:pict w14:anchorId="44B08331">
           <v:rect id="_x0000_i1122" style="width:0;height:1.5pt" o:hralign="center" o:hrstd="t" o:hr="t" fillcolor="#a0a0a0" stroked="f"/>
         </w:pict>
@@ -1172,6 +1134,7 @@
     </w:p>
     <w:p>
       <w:r>
+        <w:lastRenderedPageBreak/>
         <w:t>User finishes quiz:</w:t>
       </w:r>
     </w:p>

</xml_diff>